<commit_message>
Derive the manuscript-docx caveat and unpack the NB2-choice sentence
The caveat hardcoded 'No manuscript .docx was regenerated', which went stale the
moment the convergence fix regenerated all three table documents. It is now read
from git commit dates, so a memo shipped beside corrected tables says so.

The least-bad-choice paragraph was one ~6-line sentence with three nested
parentheticals; split into a lead, two derived bullets and a conclusion. Values
unchanged. Used an explicit first-letter uppercase rather than str.capitalize(),
which lowercases the rest and turned NB1/ZINB/M1 into nb1/zinb/m1.

Co-Authored-By: Claude Opus 5 (1M context) <noreply@anthropic.com>
</commit_message>
<xml_diff>
--- a/docs/nb2_stepwise_models.docx
+++ b/docs/nb2_stepwise_models.docx
@@ -770,7 +770,75 @@
         <w:pStyle w:val="BodyText"/>
       </w:pPr>
       <w:r>
-        <w:t xml:space="preserve">NB2 is nonetheless the least-bad single choice across both outcomes: wherever the frozen ladder has its own plain-NB1 fit at the same rung, NB2 beats it for inspections by +162.22 AIC at M1, +138.33 AIC at M3 (inspections only has an NB1 entry at M1/M3 (no M2), because ZINB, not NB1, is its selected family there), while costing NB2 +7.06 AIC at M1, +13.73 AIC at M2, +10.74 AIC at M3 against NB1 for violations at every model, M1/M2/M3 (unlike inspections, the ladder fits an NB1 at every model for violations too, because NB1 is precisely violations’ own selected family – so that M2 cost is the same number as its penalty-table row above, not a gap in coverage).</w:t>
+        <w:t xml:space="preserve">NB2 is nonetheless the least-bad</w:t>
+      </w:r>
+      <w:r>
+        <w:t xml:space="preserve"> </w:t>
+      </w:r>
+      <w:r>
+        <w:rPr>
+          <w:b/>
+          <w:bCs/>
+        </w:rPr>
+        <w:t xml:space="preserve">single</w:t>
+      </w:r>
+      <w:r>
+        <w:t xml:space="preserve"> </w:t>
+      </w:r>
+      <w:r>
+        <w:t xml:space="preserve">choice across both outcomes. The comparison that matters is against plain NB1, since that is the only family the ladder fits for both outcomes, and it runs in opposite directions:</w:t>
+      </w:r>
+    </w:p>
+    <w:p>
+      <w:pPr>
+        <w:pStyle w:val="Compact"/>
+        <w:numPr>
+          <w:ilvl w:val="0"/>
+          <w:numId w:val="1001"/>
+        </w:numPr>
+      </w:pPr>
+      <w:r>
+        <w:rPr>
+          <w:b/>
+          <w:bCs/>
+        </w:rPr>
+        <w:t xml:space="preserve">Inspections:</w:t>
+      </w:r>
+      <w:r>
+        <w:t xml:space="preserve"> </w:t>
+      </w:r>
+      <w:r>
+        <w:t xml:space="preserve">NB2 beats NB1 decisively – by +162.22 AIC at M1, +138.33 AIC at M3. (Inspections only has an NB1 entry at M1/M3 (no M2), because ZINB, not NB1, is its selected family there.)</w:t>
+      </w:r>
+    </w:p>
+    <w:p>
+      <w:pPr>
+        <w:pStyle w:val="Compact"/>
+        <w:numPr>
+          <w:ilvl w:val="0"/>
+          <w:numId w:val="1001"/>
+        </w:numPr>
+      </w:pPr>
+      <w:r>
+        <w:rPr>
+          <w:b/>
+          <w:bCs/>
+        </w:rPr>
+        <w:t xml:space="preserve">Violations:</w:t>
+      </w:r>
+      <w:r>
+        <w:t xml:space="preserve"> </w:t>
+      </w:r>
+      <w:r>
+        <w:t xml:space="preserve">NB2 costs +7.06 AIC at M1, +13.73 AIC at M2, +10.74 AIC at M3 against NB1. (Unlike inspections, the ladder fits an NB1 at every model for violations too, because NB1 is precisely violations’ own selected family. That cost is the same number as the penalty-table row above, because NB1 is what the penalty is measured against for this outcome – not a gap in coverage.)</w:t>
+      </w:r>
+    </w:p>
+    <w:p>
+      <w:pPr>
+        <w:pStyle w:val="FirstParagraph"/>
+      </w:pPr>
+      <w:r>
+        <w:t xml:space="preserve">So one family has to lose somewhere, and NB2 loses least: it gives up single-digit-to-low-double-digit AIC on violations to gain more than a hundred on inspections.</w:t>
       </w:r>
     </w:p>
     <w:p>
@@ -2137,7 +2205,7 @@
         <w:pStyle w:val="Compact"/>
         <w:numPr>
           <w:ilvl w:val="0"/>
-          <w:numId w:val="1001"/>
+          <w:numId w:val="1002"/>
         </w:numPr>
       </w:pPr>
       <w:r>
@@ -2197,198 +2265,6 @@
       </w:r>
       <w:r>
         <w:t xml:space="preserve">p = 0.975 – none significant at p&lt;.05.</w:t>
-      </w:r>
-    </w:p>
-    <w:p>
-      <w:pPr>
-        <w:pStyle w:val="Compact"/>
-        <w:numPr>
-          <w:ilvl w:val="0"/>
-          <w:numId w:val="1001"/>
-        </w:numPr>
-      </w:pPr>
-      <w:r>
-        <w:rPr>
-          <w:b/>
-          <w:bCs/>
-        </w:rPr>
-        <w:t xml:space="preserve">violations:</w:t>
-      </w:r>
-      <w:r>
-        <w:t xml:space="preserve"> </w:t>
-      </w:r>
-      <w:r>
-        <w:t xml:space="preserve">Model 3 improved on Model 2 by AIC (3640.89 vs 3644.20, delta = -3.31 for three added parameters); the added H-2A-block coefficients are</w:t>
-      </w:r>
-      <w:r>
-        <w:t xml:space="preserve"> </w:t>
-      </w:r>
-      <w:r>
-        <w:rPr>
-          <w:rStyle w:val="VerbatimChar"/>
-        </w:rPr>
-        <w:t xml:space="preserve">h2a_per_farmworker_z</w:t>
-      </w:r>
-      <w:r>
-        <w:t xml:space="preserve"> </w:t>
-      </w:r>
-      <w:r>
-        <w:t xml:space="preserve">p = 0.105,</w:t>
-      </w:r>
-      <w:r>
-        <w:t xml:space="preserve"> </w:t>
-      </w:r>
-      <w:r>
-        <w:rPr>
-          <w:rStyle w:val="VerbatimChar"/>
-        </w:rPr>
-        <w:t xml:space="preserve">dol_demand_met_pct_z</w:t>
-      </w:r>
-      <w:r>
-        <w:t xml:space="preserve"> </w:t>
-      </w:r>
-      <w:r>
-        <w:t xml:space="preserve">p = 0.481,</w:t>
-      </w:r>
-      <w:r>
-        <w:t xml:space="preserve"> </w:t>
-      </w:r>
-      <w:r>
-        <w:rPr>
-          <w:rStyle w:val="VerbatimChar"/>
-        </w:rPr>
-        <w:t xml:space="preserve">pct_flc_z</w:t>
-      </w:r>
-      <w:r>
-        <w:t xml:space="preserve"> </w:t>
-      </w:r>
-      <w:r>
-        <w:t xml:space="preserve">p = 0.168 – none significant at p&lt;.05.</w:t>
-      </w:r>
-    </w:p>
-    <w:p>
-      <w:pPr>
-        <w:pStyle w:val="FirstParagraph"/>
-      </w:pPr>
-      <w:r>
-        <w:rPr>
-          <w:b/>
-          <w:bCs/>
-        </w:rPr>
-        <w:t xml:space="preserve">Why two reduction columns.</w:t>
-      </w:r>
-      <w:r>
-        <w:t xml:space="preserve"> </w:t>
-      </w:r>
-      <w:r>
-        <w:t xml:space="preserve">Model 1 keeps all 49 states; Models 2 and 3 keep 46, because AK, RI and VT have no BLS pesticide-applicator series and drop by listwise deletion once</w:t>
-      </w:r>
-      <w:r>
-        <w:t xml:space="preserve"> </w:t>
-      </w:r>
-      <w:r>
-        <w:rPr>
-          <w:rStyle w:val="VerbatimChar"/>
-        </w:rPr>
-        <w:t xml:space="preserve">SPEND_APP_z</w:t>
-      </w:r>
-      <w:r>
-        <w:t xml:space="preserve"> </w:t>
-      </w:r>
-      <w:r>
-        <w:t xml:space="preserve">enters.</w:t>
-      </w:r>
-      <w:r>
-        <w:t xml:space="preserve"> </w:t>
-      </w:r>
-      <w:r>
-        <w:rPr>
-          <w:rStyle w:val="VerbatimChar"/>
-        </w:rPr>
-        <w:t xml:space="preserve">Delta sigma^2_u0 %</w:t>
-      </w:r>
-      <w:r>
-        <w:t xml:space="preserve"> </w:t>
-      </w:r>
-      <w:r>
-        <w:t xml:space="preserve">is measured against a single Model-1 baseline on Model 1’s own sample, so every column starts from Model 1.</w:t>
-      </w:r>
-      <w:r>
-        <w:t xml:space="preserve"> </w:t>
-      </w:r>
-      <w:r>
-        <w:rPr>
-          <w:rStyle w:val="VerbatimChar"/>
-        </w:rPr>
-        <w:t xml:space="preserve">Delta % matched</w:t>
-      </w:r>
-      <w:r>
-        <w:t xml:space="preserve"> </w:t>
-      </w:r>
-      <w:r>
-        <w:t xml:space="preserve">refits the Model-1 baseline on the Model-2/3 sample, so the difference between the two columns is exactly what those three states contributed. Neither number alone tells the truth; read both.</w:t>
-      </w:r>
-    </w:p>
-    <w:p>
-      <w:pPr>
-        <w:pStyle w:val="BodyText"/>
-      </w:pPr>
-      <w:r>
-        <w:rPr>
-          <w:b/>
-          <w:bCs/>
-        </w:rPr>
-        <w:t xml:space="preserve">On the Model-1 row specifically,</w:t>
-      </w:r>
-      <w:r>
-        <w:rPr>
-          <w:b/>
-          <w:bCs/>
-        </w:rPr>
-        <w:t xml:space="preserve"> </w:t>
-      </w:r>
-      <w:r>
-        <w:rPr>
-          <w:rStyle w:val="VerbatimChar"/>
-          <w:b/>
-          <w:bCs/>
-        </w:rPr>
-        <w:t xml:space="preserve">Delta % matched</w:t>
-      </w:r>
-      <w:r>
-        <w:rPr>
-          <w:b/>
-          <w:bCs/>
-        </w:rPr>
-        <w:t xml:space="preserve"> </w:t>
-      </w:r>
-      <w:r>
-        <w:rPr>
-          <w:b/>
-          <w:bCs/>
-        </w:rPr>
-        <w:t xml:space="preserve">is not zero even though Model 1 has no covariates to explain anything</w:t>
-      </w:r>
-      <w:r>
-        <w:t xml:space="preserve"> </w:t>
-      </w:r>
-      <w:r>
-        <w:t xml:space="preserve">(inspections -13.3%; violations +2.2%). That is not model improvement – Model 1 has only one formula, fit twice, once on 49 states and once on 46. The entire M1-row value is exactly the sample effect described in the paragraph above, and nothing else.</w:t>
-      </w:r>
-    </w:p>
-    <w:p>
-      <w:pPr>
-        <w:pStyle w:val="BodyText"/>
-      </w:pPr>
-      <w:r>
-        <w:rPr>
-          <w:b/>
-          <w:bCs/>
-        </w:rPr>
-        <w:t xml:space="preserve">And the two columns differ in opposite directions by outcome</w:t>
-      </w:r>
-      <w:r>
-        <w:t xml:space="preserve">, which is why the generic warning is not written here:</w:t>
       </w:r>
     </w:p>
     <w:p>
@@ -2404,13 +2280,183 @@
           <w:b/>
           <w:bCs/>
         </w:rPr>
-        <w:t xml:space="preserve">inspections:</w:t>
-      </w:r>
-      <w:r>
-        <w:t xml:space="preserve"> </w:t>
-      </w:r>
-      <w:r>
-        <w:t xml:space="preserve">dropping AK, RI and VT lowers the Model-1 between-state variance (1.1069 on 49 states -&gt; 0.9769 on 46), so the Model-1 basis overstates what the covariates do: Model 3 reduces sigma^2_u0 by +16.3% against Model 1 but +5.1% against the matched baseline.</w:t>
+        <w:t xml:space="preserve">violations:</w:t>
+      </w:r>
+      <w:r>
+        <w:t xml:space="preserve"> </w:t>
+      </w:r>
+      <w:r>
+        <w:t xml:space="preserve">Model 3 improved on Model 2 by AIC (3640.89 vs 3644.20, delta = -3.31 for three added parameters); the added H-2A-block coefficients are</w:t>
+      </w:r>
+      <w:r>
+        <w:t xml:space="preserve"> </w:t>
+      </w:r>
+      <w:r>
+        <w:rPr>
+          <w:rStyle w:val="VerbatimChar"/>
+        </w:rPr>
+        <w:t xml:space="preserve">h2a_per_farmworker_z</w:t>
+      </w:r>
+      <w:r>
+        <w:t xml:space="preserve"> </w:t>
+      </w:r>
+      <w:r>
+        <w:t xml:space="preserve">p = 0.105,</w:t>
+      </w:r>
+      <w:r>
+        <w:t xml:space="preserve"> </w:t>
+      </w:r>
+      <w:r>
+        <w:rPr>
+          <w:rStyle w:val="VerbatimChar"/>
+        </w:rPr>
+        <w:t xml:space="preserve">dol_demand_met_pct_z</w:t>
+      </w:r>
+      <w:r>
+        <w:t xml:space="preserve"> </w:t>
+      </w:r>
+      <w:r>
+        <w:t xml:space="preserve">p = 0.481,</w:t>
+      </w:r>
+      <w:r>
+        <w:t xml:space="preserve"> </w:t>
+      </w:r>
+      <w:r>
+        <w:rPr>
+          <w:rStyle w:val="VerbatimChar"/>
+        </w:rPr>
+        <w:t xml:space="preserve">pct_flc_z</w:t>
+      </w:r>
+      <w:r>
+        <w:t xml:space="preserve"> </w:t>
+      </w:r>
+      <w:r>
+        <w:t xml:space="preserve">p = 0.168 – none significant at p&lt;.05.</w:t>
+      </w:r>
+    </w:p>
+    <w:p>
+      <w:pPr>
+        <w:pStyle w:val="FirstParagraph"/>
+      </w:pPr>
+      <w:r>
+        <w:rPr>
+          <w:b/>
+          <w:bCs/>
+        </w:rPr>
+        <w:t xml:space="preserve">Why two reduction columns.</w:t>
+      </w:r>
+      <w:r>
+        <w:t xml:space="preserve"> </w:t>
+      </w:r>
+      <w:r>
+        <w:t xml:space="preserve">Model 1 keeps all 49 states; Models 2 and 3 keep 46, because AK, RI and VT have no BLS pesticide-applicator series and drop by listwise deletion once</w:t>
+      </w:r>
+      <w:r>
+        <w:t xml:space="preserve"> </w:t>
+      </w:r>
+      <w:r>
+        <w:rPr>
+          <w:rStyle w:val="VerbatimChar"/>
+        </w:rPr>
+        <w:t xml:space="preserve">SPEND_APP_z</w:t>
+      </w:r>
+      <w:r>
+        <w:t xml:space="preserve"> </w:t>
+      </w:r>
+      <w:r>
+        <w:t xml:space="preserve">enters.</w:t>
+      </w:r>
+      <w:r>
+        <w:t xml:space="preserve"> </w:t>
+      </w:r>
+      <w:r>
+        <w:rPr>
+          <w:rStyle w:val="VerbatimChar"/>
+        </w:rPr>
+        <w:t xml:space="preserve">Delta sigma^2_u0 %</w:t>
+      </w:r>
+      <w:r>
+        <w:t xml:space="preserve"> </w:t>
+      </w:r>
+      <w:r>
+        <w:t xml:space="preserve">is measured against a single Model-1 baseline on Model 1’s own sample, so every column starts from Model 1.</w:t>
+      </w:r>
+      <w:r>
+        <w:t xml:space="preserve"> </w:t>
+      </w:r>
+      <w:r>
+        <w:rPr>
+          <w:rStyle w:val="VerbatimChar"/>
+        </w:rPr>
+        <w:t xml:space="preserve">Delta % matched</w:t>
+      </w:r>
+      <w:r>
+        <w:t xml:space="preserve"> </w:t>
+      </w:r>
+      <w:r>
+        <w:t xml:space="preserve">refits the Model-1 baseline on the Model-2/3 sample, so the difference between the two columns is exactly what those three states contributed. Neither number alone tells the truth; read both.</w:t>
+      </w:r>
+    </w:p>
+    <w:p>
+      <w:pPr>
+        <w:pStyle w:val="BodyText"/>
+      </w:pPr>
+      <w:r>
+        <w:rPr>
+          <w:b/>
+          <w:bCs/>
+        </w:rPr>
+        <w:t xml:space="preserve">On the Model-1 row specifically,</w:t>
+      </w:r>
+      <w:r>
+        <w:rPr>
+          <w:b/>
+          <w:bCs/>
+        </w:rPr>
+        <w:t xml:space="preserve"> </w:t>
+      </w:r>
+      <w:r>
+        <w:rPr>
+          <w:rStyle w:val="VerbatimChar"/>
+          <w:b/>
+          <w:bCs/>
+        </w:rPr>
+        <w:t xml:space="preserve">Delta % matched</w:t>
+      </w:r>
+      <w:r>
+        <w:rPr>
+          <w:b/>
+          <w:bCs/>
+        </w:rPr>
+        <w:t xml:space="preserve"> </w:t>
+      </w:r>
+      <w:r>
+        <w:rPr>
+          <w:b/>
+          <w:bCs/>
+        </w:rPr>
+        <w:t xml:space="preserve">is not zero even though Model 1 has no covariates to explain anything</w:t>
+      </w:r>
+      <w:r>
+        <w:t xml:space="preserve"> </w:t>
+      </w:r>
+      <w:r>
+        <w:t xml:space="preserve">(inspections -13.3%; violations +2.2%). That is not model improvement – Model 1 has only one formula, fit twice, once on 49 states and once on 46. The entire M1-row value is exactly the sample effect described in the paragraph above, and nothing else.</w:t>
+      </w:r>
+    </w:p>
+    <w:p>
+      <w:pPr>
+        <w:pStyle w:val="BodyText"/>
+      </w:pPr>
+      <w:r>
+        <w:rPr>
+          <w:b/>
+          <w:bCs/>
+        </w:rPr>
+        <w:t xml:space="preserve">And the two columns differ in opposite directions by outcome</w:t>
+      </w:r>
+      <w:r>
+        <w:t xml:space="preserve">, which is why the generic warning is not written here:</w:t>
       </w:r>
     </w:p>
     <w:p>
@@ -2418,7 +2464,29 @@
         <w:pStyle w:val="Compact"/>
         <w:numPr>
           <w:ilvl w:val="0"/>
-          <w:numId w:val="1002"/>
+          <w:numId w:val="1003"/>
+        </w:numPr>
+      </w:pPr>
+      <w:r>
+        <w:rPr>
+          <w:b/>
+          <w:bCs/>
+        </w:rPr>
+        <w:t xml:space="preserve">inspections:</w:t>
+      </w:r>
+      <w:r>
+        <w:t xml:space="preserve"> </w:t>
+      </w:r>
+      <w:r>
+        <w:t xml:space="preserve">dropping AK, RI and VT lowers the Model-1 between-state variance (1.1069 on 49 states -&gt; 0.9769 on 46), so the Model-1 basis overstates what the covariates do: Model 3 reduces sigma^2_u0 by +16.3% against Model 1 but +5.1% against the matched baseline.</w:t>
+      </w:r>
+    </w:p>
+    <w:p>
+      <w:pPr>
+        <w:pStyle w:val="Compact"/>
+        <w:numPr>
+          <w:ilvl w:val="0"/>
+          <w:numId w:val="1003"/>
         </w:numPr>
       </w:pPr>
       <w:r>
@@ -4553,7 +4621,7 @@
         <w:pStyle w:val="Compact"/>
         <w:numPr>
           <w:ilvl w:val="0"/>
-          <w:numId w:val="1003"/>
+          <w:numId w:val="1004"/>
         </w:numPr>
       </w:pPr>
       <w:r>
@@ -4575,7 +4643,7 @@
         <w:pStyle w:val="Compact"/>
         <w:numPr>
           <w:ilvl w:val="0"/>
-          <w:numId w:val="1003"/>
+          <w:numId w:val="1004"/>
         </w:numPr>
       </w:pPr>
       <w:r>
@@ -4606,7 +4674,7 @@
         <w:pStyle w:val="Compact"/>
         <w:numPr>
           <w:ilvl w:val="0"/>
-          <w:numId w:val="1003"/>
+          <w:numId w:val="1004"/>
         </w:numPr>
       </w:pPr>
       <w:r>
@@ -4688,7 +4756,7 @@
         <w:pStyle w:val="Compact"/>
         <w:numPr>
           <w:ilvl w:val="0"/>
-          <w:numId w:val="1003"/>
+          <w:numId w:val="1004"/>
         </w:numPr>
       </w:pPr>
       <w:r>
@@ -4710,7 +4778,7 @@
         <w:pStyle w:val="Compact"/>
         <w:numPr>
           <w:ilvl w:val="0"/>
-          <w:numId w:val="1003"/>
+          <w:numId w:val="1004"/>
         </w:numPr>
       </w:pPr>
       <w:r>
@@ -4741,7 +4809,7 @@
         <w:pStyle w:val="Compact"/>
         <w:numPr>
           <w:ilvl w:val="0"/>
-          <w:numId w:val="1003"/>
+          <w:numId w:val="1004"/>
         </w:numPr>
       </w:pPr>
       <w:r>
@@ -5862,7 +5930,7 @@
         <w:pStyle w:val="Compact"/>
         <w:numPr>
           <w:ilvl w:val="0"/>
-          <w:numId w:val="1004"/>
+          <w:numId w:val="1005"/>
         </w:numPr>
       </w:pPr>
       <w:r>
@@ -5874,7 +5942,7 @@
         <w:pStyle w:val="Compact"/>
         <w:numPr>
           <w:ilvl w:val="0"/>
-          <w:numId w:val="1004"/>
+          <w:numId w:val="1005"/>
         </w:numPr>
       </w:pPr>
       <w:r>
@@ -5886,7 +5954,7 @@
         <w:pStyle w:val="Compact"/>
         <w:numPr>
           <w:ilvl w:val="0"/>
-          <w:numId w:val="1004"/>
+          <w:numId w:val="1005"/>
         </w:numPr>
       </w:pPr>
       <w:r>
@@ -5898,7 +5966,7 @@
         <w:pStyle w:val="Compact"/>
         <w:numPr>
           <w:ilvl w:val="0"/>
-          <w:numId w:val="1004"/>
+          <w:numId w:val="1005"/>
         </w:numPr>
       </w:pPr>
       <w:r>
@@ -5910,7 +5978,7 @@
         <w:pStyle w:val="Compact"/>
         <w:numPr>
           <w:ilvl w:val="0"/>
-          <w:numId w:val="1004"/>
+          <w:numId w:val="1005"/>
         </w:numPr>
       </w:pPr>
       <w:r>
@@ -5922,7 +5990,7 @@
         <w:pStyle w:val="Compact"/>
         <w:numPr>
           <w:ilvl w:val="0"/>
-          <w:numId w:val="1004"/>
+          <w:numId w:val="1005"/>
         </w:numPr>
       </w:pPr>
       <w:r>
@@ -5941,7 +6009,40 @@
         <w:t xml:space="preserve"> </w:t>
       </w:r>
       <w:r>
-        <w:t xml:space="preserve">was regenerated.</w:t>
+        <w:t xml:space="preserve">is produced by this arm, but three have since been regenerated by other work (</w:t>
+      </w:r>
+      <w:r>
+        <w:rPr>
+          <w:rStyle w:val="VerbatimChar"/>
+        </w:rPr>
+        <w:t xml:space="preserve">WPS_Table_Sheels_augmented.docx</w:t>
+      </w:r>
+      <w:r>
+        <w:t xml:space="preserve">,</w:t>
+      </w:r>
+      <w:r>
+        <w:t xml:space="preserve"> </w:t>
+      </w:r>
+      <w:r>
+        <w:rPr>
+          <w:rStyle w:val="VerbatimChar"/>
+        </w:rPr>
+        <w:t xml:space="preserve">WPS_Table_Sheels_augmented_2021.docx</w:t>
+      </w:r>
+      <w:r>
+        <w:t xml:space="preserve">,</w:t>
+      </w:r>
+      <w:r>
+        <w:t xml:space="preserve"> </w:t>
+      </w:r>
+      <w:r>
+        <w:rPr>
+          <w:rStyle w:val="VerbatimChar"/>
+        </w:rPr>
+        <w:t xml:space="preserve">WPS_Table_Sheels_filled_corrected.docx</w:t>
+      </w:r>
+      <w:r>
+        <w:t xml:space="preserve">) – so those tables and this memo are not from the same run. That regeneration was the convergence fix to the log-linear table scripts, which is unrelated to the models reported here.</w:t>
       </w:r>
     </w:p>
     <w:bookmarkEnd w:id="31"/>
@@ -6172,6 +6273,9 @@
     <w:abstractNumId w:val="991"/>
   </w:num>
   <w:num w:numId="1004">
+    <w:abstractNumId w:val="991"/>
+  </w:num>
+  <w:num w:numId="1005">
     <w:abstractNumId w:val="991"/>
   </w:num>
 </w:numbering>

</xml_diff>